<commit_message>
Update Guia de Utilização do Sistema de Gestão Financeira - V. 1.3.1.docx
</commit_message>
<xml_diff>
--- a/Guia de Utilização do Sistema de Gestão Financeira - V. 1.3.1.docx
+++ b/Guia de Utilização do Sistema de Gestão Financeira - V. 1.3.1.docx
@@ -4110,6 +4110,766 @@
     </w:sdt>
     <w:p>
       <w:pPr>
+        <w:pStyle w:val="Ttulo2"/>
+        <w:rPr>
+          <w:rFonts w:asciiTheme="minorHAnsi" w:hAnsiTheme="minorHAnsi" w:cstheme="minorHAnsi"/>
+        </w:rPr>
+      </w:pPr>
+      <w:r>
+        <w:rPr>
+          <w:rStyle w:val="Forte"/>
+          <w:rFonts w:asciiTheme="minorHAnsi" w:hAnsiTheme="minorHAnsi" w:cstheme="minorHAnsi"/>
+          <w:b/>
+          <w:bCs/>
+        </w:rPr>
+        <w:lastRenderedPageBreak/>
+        <w:t>Apresentação e Propósito do Sistema</w:t>
+      </w:r>
+    </w:p>
+    <w:p>
+      <w:pPr>
+        <w:pStyle w:val="whitespace-normal"/>
+        <w:numPr>
+          <w:ilvl w:val="0"/>
+          <w:numId w:val="20"/>
+        </w:numPr>
+        <w:rPr>
+          <w:rFonts w:asciiTheme="minorHAnsi" w:hAnsiTheme="minorHAnsi" w:cstheme="minorHAnsi"/>
+        </w:rPr>
+      </w:pPr>
+      <w:r>
+        <w:rPr>
+          <w:rStyle w:val="Forte"/>
+          <w:rFonts w:asciiTheme="minorHAnsi" w:hAnsiTheme="minorHAnsi" w:cstheme="minorHAnsi"/>
+        </w:rPr>
+        <w:t>O que é</w:t>
+      </w:r>
+      <w:r>
+        <w:rPr>
+          <w:rFonts w:asciiTheme="minorHAnsi" w:hAnsiTheme="minorHAnsi" w:cstheme="minorHAnsi"/>
+        </w:rPr>
+        <w:t>: Sistema de Gestão Financeira desenvolvido especificamente para a RVR Engenharia</w:t>
+      </w:r>
+    </w:p>
+    <w:p>
+      <w:pPr>
+        <w:pStyle w:val="whitespace-normal"/>
+        <w:numPr>
+          <w:ilvl w:val="0"/>
+          <w:numId w:val="20"/>
+        </w:numPr>
+        <w:rPr>
+          <w:rFonts w:asciiTheme="minorHAnsi" w:hAnsiTheme="minorHAnsi" w:cstheme="minorHAnsi"/>
+        </w:rPr>
+      </w:pPr>
+      <w:r>
+        <w:rPr>
+          <w:rStyle w:val="Forte"/>
+          <w:rFonts w:asciiTheme="minorHAnsi" w:hAnsiTheme="minorHAnsi" w:cstheme="minorHAnsi"/>
+        </w:rPr>
+        <w:t>Para que serve</w:t>
+      </w:r>
+      <w:r>
+        <w:rPr>
+          <w:rFonts w:asciiTheme="minorHAnsi" w:hAnsiTheme="minorHAnsi" w:cstheme="minorHAnsi"/>
+        </w:rPr>
+        <w:t>: Controle centralizado de gastos e despesas dos clientes de construção de casas de alto padrão</w:t>
+      </w:r>
+    </w:p>
+    <w:p>
+      <w:pPr>
+        <w:pStyle w:val="whitespace-normal"/>
+        <w:numPr>
+          <w:ilvl w:val="0"/>
+          <w:numId w:val="20"/>
+        </w:numPr>
+        <w:rPr>
+          <w:rFonts w:asciiTheme="minorHAnsi" w:hAnsiTheme="minorHAnsi" w:cstheme="minorHAnsi"/>
+        </w:rPr>
+      </w:pPr>
+      <w:r>
+        <w:rPr>
+          <w:rStyle w:val="Forte"/>
+          <w:rFonts w:asciiTheme="minorHAnsi" w:hAnsiTheme="minorHAnsi" w:cstheme="minorHAnsi"/>
+        </w:rPr>
+        <w:t>Objetivo principal</w:t>
+      </w:r>
+      <w:r>
+        <w:rPr>
+          <w:rFonts w:asciiTheme="minorHAnsi" w:hAnsiTheme="minorHAnsi" w:cstheme="minorHAnsi"/>
+        </w:rPr>
+        <w:t>: Gerar relatórios quinzenais precisos e facilitar a gestão financeira de múltiplos projetos</w:t>
+      </w:r>
+    </w:p>
+    <w:p>
+      <w:pPr>
+        <w:pStyle w:val="Ttulo2"/>
+        <w:rPr>
+          <w:rFonts w:asciiTheme="minorHAnsi" w:hAnsiTheme="minorHAnsi" w:cstheme="minorHAnsi"/>
+        </w:rPr>
+      </w:pPr>
+      <w:r>
+        <w:rPr>
+          <w:rStyle w:val="Forte"/>
+          <w:rFonts w:asciiTheme="minorHAnsi" w:hAnsiTheme="minorHAnsi" w:cstheme="minorHAnsi"/>
+          <w:b/>
+          <w:bCs/>
+        </w:rPr>
+        <w:t>Visão Geral das Funcionalidades</w:t>
+      </w:r>
+    </w:p>
+    <w:p>
+      <w:pPr>
+        <w:pStyle w:val="whitespace-normal"/>
+        <w:numPr>
+          <w:ilvl w:val="0"/>
+          <w:numId w:val="21"/>
+        </w:numPr>
+        <w:rPr>
+          <w:rFonts w:asciiTheme="minorHAnsi" w:hAnsiTheme="minorHAnsi" w:cstheme="minorHAnsi"/>
+        </w:rPr>
+      </w:pPr>
+      <w:r>
+        <w:rPr>
+          <w:rFonts w:asciiTheme="minorHAnsi" w:hAnsiTheme="minorHAnsi" w:cstheme="minorHAnsi"/>
+          <w:b/>
+          <w:bCs/>
+        </w:rPr>
+        <w:t>Entrada de Dados</w:t>
+      </w:r>
+      <w:r>
+        <w:rPr>
+          <w:rFonts w:asciiTheme="minorHAnsi" w:hAnsiTheme="minorHAnsi" w:cstheme="minorHAnsi"/>
+          <w:b/>
+          <w:bCs/>
+        </w:rPr>
+        <w:t>:</w:t>
+      </w:r>
+      <w:r>
+        <w:rPr>
+          <w:rFonts w:asciiTheme="minorHAnsi" w:hAnsiTheme="minorHAnsi" w:cstheme="minorHAnsi"/>
+        </w:rPr>
+        <w:t xml:space="preserve"> cadastros e lançamentos</w:t>
+      </w:r>
+      <w:r>
+        <w:rPr>
+          <w:rFonts w:asciiTheme="minorHAnsi" w:hAnsiTheme="minorHAnsi" w:cstheme="minorHAnsi"/>
+        </w:rPr>
+        <w:t xml:space="preserve"> de clientes, fornecedores, faturas, boletos, reembolsos, parcelamentos, </w:t>
+      </w:r>
+      <w:r>
+        <w:rPr>
+          <w:rFonts w:asciiTheme="minorHAnsi" w:hAnsiTheme="minorHAnsi" w:cstheme="minorHAnsi"/>
+        </w:rPr>
+        <w:t xml:space="preserve">importação de </w:t>
+      </w:r>
+      <w:r>
+        <w:rPr>
+          <w:rFonts w:asciiTheme="minorHAnsi" w:hAnsiTheme="minorHAnsi" w:cstheme="minorHAnsi"/>
+        </w:rPr>
+        <w:t>folha de pagamentos, diárias de colaboradores, etc.</w:t>
+      </w:r>
+    </w:p>
+    <w:p>
+      <w:pPr>
+        <w:pStyle w:val="whitespace-normal"/>
+        <w:numPr>
+          <w:ilvl w:val="0"/>
+          <w:numId w:val="21"/>
+        </w:numPr>
+        <w:rPr>
+          <w:rFonts w:asciiTheme="minorHAnsi" w:hAnsiTheme="minorHAnsi" w:cstheme="minorHAnsi"/>
+        </w:rPr>
+      </w:pPr>
+      <w:r>
+        <w:rPr>
+          <w:rFonts w:asciiTheme="minorHAnsi" w:hAnsiTheme="minorHAnsi" w:cstheme="minorHAnsi"/>
+          <w:b/>
+          <w:bCs/>
+        </w:rPr>
+        <w:t>Taxas de Administração</w:t>
+      </w:r>
+      <w:r>
+        <w:rPr>
+          <w:rFonts w:asciiTheme="minorHAnsi" w:hAnsiTheme="minorHAnsi" w:cstheme="minorHAnsi"/>
+        </w:rPr>
+        <w:t>:</w:t>
+      </w:r>
+      <w:r>
+        <w:rPr>
+          <w:rFonts w:asciiTheme="minorHAnsi" w:hAnsiTheme="minorHAnsi" w:cstheme="minorHAnsi"/>
+        </w:rPr>
+        <w:t xml:space="preserve"> </w:t>
+      </w:r>
+      <w:r>
+        <w:rPr>
+          <w:rFonts w:asciiTheme="minorHAnsi" w:hAnsiTheme="minorHAnsi" w:cstheme="minorHAnsi"/>
+        </w:rPr>
+        <w:t xml:space="preserve">cadastro de contrato de administração de obra, com descrição dos eventos/fases e </w:t>
+      </w:r>
+      <w:r>
+        <w:rPr>
+          <w:rFonts w:asciiTheme="minorHAnsi" w:hAnsiTheme="minorHAnsi" w:cstheme="minorHAnsi"/>
+        </w:rPr>
+        <w:t>controle de pagamentos</w:t>
+      </w:r>
+      <w:r>
+        <w:rPr>
+          <w:rFonts w:asciiTheme="minorHAnsi" w:hAnsiTheme="minorHAnsi" w:cstheme="minorHAnsi"/>
+        </w:rPr>
+        <w:t xml:space="preserve"> por percentual de gastos ou parcelas</w:t>
+      </w:r>
+    </w:p>
+    <w:p>
+      <w:pPr>
+        <w:pStyle w:val="whitespace-normal"/>
+        <w:numPr>
+          <w:ilvl w:val="0"/>
+          <w:numId w:val="21"/>
+        </w:numPr>
+        <w:rPr>
+          <w:rFonts w:asciiTheme="minorHAnsi" w:hAnsiTheme="minorHAnsi" w:cstheme="minorHAnsi"/>
+        </w:rPr>
+      </w:pPr>
+      <w:r>
+        <w:rPr>
+          <w:rFonts w:asciiTheme="minorHAnsi" w:hAnsiTheme="minorHAnsi" w:cstheme="minorHAnsi"/>
+          <w:b/>
+          <w:bCs/>
+        </w:rPr>
+        <w:t>Despesas Rateadas</w:t>
+      </w:r>
+      <w:r>
+        <w:rPr>
+          <w:rFonts w:asciiTheme="minorHAnsi" w:hAnsiTheme="minorHAnsi" w:cstheme="minorHAnsi"/>
+        </w:rPr>
+        <w:t>:</w:t>
+      </w:r>
+      <w:r>
+        <w:rPr>
+          <w:rFonts w:asciiTheme="minorHAnsi" w:hAnsiTheme="minorHAnsi" w:cstheme="minorHAnsi"/>
+        </w:rPr>
+        <w:t xml:space="preserve"> </w:t>
+      </w:r>
+      <w:r>
+        <w:rPr>
+          <w:rFonts w:asciiTheme="minorHAnsi" w:hAnsiTheme="minorHAnsi" w:cstheme="minorHAnsi"/>
+        </w:rPr>
+        <w:t xml:space="preserve">lançamentos de </w:t>
+      </w:r>
+      <w:r>
+        <w:rPr>
+          <w:rFonts w:asciiTheme="minorHAnsi" w:hAnsiTheme="minorHAnsi" w:cstheme="minorHAnsi"/>
+        </w:rPr>
+        <w:t>custos compartilhados</w:t>
+      </w:r>
+      <w:r>
+        <w:rPr>
+          <w:rFonts w:asciiTheme="minorHAnsi" w:hAnsiTheme="minorHAnsi" w:cstheme="minorHAnsi"/>
+        </w:rPr>
+        <w:t xml:space="preserve"> em uma única tela, agilizando a rotina</w:t>
+      </w:r>
+    </w:p>
+    <w:p>
+      <w:pPr>
+        <w:pStyle w:val="whitespace-normal"/>
+        <w:numPr>
+          <w:ilvl w:val="0"/>
+          <w:numId w:val="21"/>
+        </w:numPr>
+        <w:rPr>
+          <w:rFonts w:asciiTheme="minorHAnsi" w:hAnsiTheme="minorHAnsi" w:cstheme="minorHAnsi"/>
+        </w:rPr>
+      </w:pPr>
+      <w:r>
+        <w:rPr>
+          <w:rFonts w:asciiTheme="minorHAnsi" w:hAnsiTheme="minorHAnsi" w:cstheme="minorHAnsi"/>
+          <w:b/>
+          <w:bCs/>
+        </w:rPr>
+        <w:t>Geração de Relatórios</w:t>
+      </w:r>
+      <w:r>
+        <w:rPr>
+          <w:rFonts w:asciiTheme="minorHAnsi" w:hAnsiTheme="minorHAnsi" w:cstheme="minorHAnsi"/>
+        </w:rPr>
+        <w:t>:</w:t>
+      </w:r>
+      <w:r>
+        <w:rPr>
+          <w:rFonts w:asciiTheme="minorHAnsi" w:hAnsiTheme="minorHAnsi" w:cstheme="minorHAnsi"/>
+        </w:rPr>
+        <w:t xml:space="preserve"> análises quinzenais</w:t>
+      </w:r>
+      <w:r>
+        <w:rPr>
+          <w:rFonts w:asciiTheme="minorHAnsi" w:hAnsiTheme="minorHAnsi" w:cstheme="minorHAnsi"/>
+        </w:rPr>
+        <w:t>, maiores fornecedores, por tipo de despesa, por categoria, acompanhamento de medições de empreiteiros</w:t>
+      </w:r>
+    </w:p>
+    <w:p>
+      <w:pPr>
+        <w:pStyle w:val="whitespace-normal"/>
+        <w:numPr>
+          <w:ilvl w:val="0"/>
+          <w:numId w:val="21"/>
+        </w:numPr>
+        <w:rPr>
+          <w:rFonts w:asciiTheme="minorHAnsi" w:hAnsiTheme="minorHAnsi" w:cstheme="minorHAnsi"/>
+        </w:rPr>
+      </w:pPr>
+      <w:r>
+        <w:rPr>
+          <w:rFonts w:asciiTheme="minorHAnsi" w:hAnsiTheme="minorHAnsi" w:cstheme="minorHAnsi"/>
+          <w:b/>
+          <w:bCs/>
+        </w:rPr>
+        <w:t>Gestão de Medições</w:t>
+      </w:r>
+      <w:r>
+        <w:rPr>
+          <w:rFonts w:asciiTheme="minorHAnsi" w:hAnsiTheme="minorHAnsi" w:cstheme="minorHAnsi"/>
+        </w:rPr>
+        <w:t>:</w:t>
+      </w:r>
+      <w:r>
+        <w:rPr>
+          <w:rFonts w:asciiTheme="minorHAnsi" w:hAnsiTheme="minorHAnsi" w:cstheme="minorHAnsi"/>
+        </w:rPr>
+        <w:t xml:space="preserve"> c</w:t>
+      </w:r>
+      <w:r>
+        <w:rPr>
+          <w:rFonts w:asciiTheme="minorHAnsi" w:hAnsiTheme="minorHAnsi" w:cstheme="minorHAnsi"/>
+        </w:rPr>
+        <w:t>adastro de c</w:t>
+      </w:r>
+      <w:r>
+        <w:rPr>
+          <w:rFonts w:asciiTheme="minorHAnsi" w:hAnsiTheme="minorHAnsi" w:cstheme="minorHAnsi"/>
+        </w:rPr>
+        <w:t>ontratos</w:t>
+      </w:r>
+      <w:r>
+        <w:rPr>
+          <w:rFonts w:asciiTheme="minorHAnsi" w:hAnsiTheme="minorHAnsi" w:cstheme="minorHAnsi"/>
+        </w:rPr>
+        <w:t>, a</w:t>
+      </w:r>
+      <w:r>
+        <w:rPr>
+          <w:rFonts w:asciiTheme="minorHAnsi" w:hAnsiTheme="minorHAnsi" w:cstheme="minorHAnsi"/>
+        </w:rPr>
+        <w:t>com</w:t>
+      </w:r>
+      <w:r>
+        <w:rPr>
+          <w:rFonts w:asciiTheme="minorHAnsi" w:hAnsiTheme="minorHAnsi" w:cstheme="minorHAnsi"/>
+        </w:rPr>
+        <w:t>panhamento e lançamentos de medições de</w:t>
+      </w:r>
+      <w:r>
+        <w:rPr>
+          <w:rFonts w:asciiTheme="minorHAnsi" w:hAnsiTheme="minorHAnsi" w:cstheme="minorHAnsi"/>
+        </w:rPr>
+        <w:t xml:space="preserve"> empreiteiros</w:t>
+      </w:r>
+    </w:p>
+    <w:p>
+      <w:pPr>
+        <w:pStyle w:val="whitespace-normal"/>
+        <w:numPr>
+          <w:ilvl w:val="0"/>
+          <w:numId w:val="21"/>
+        </w:numPr>
+        <w:rPr>
+          <w:rFonts w:asciiTheme="minorHAnsi" w:hAnsiTheme="minorHAnsi" w:cstheme="minorHAnsi"/>
+        </w:rPr>
+      </w:pPr>
+      <w:r>
+        <w:rPr>
+          <w:rFonts w:asciiTheme="minorHAnsi" w:hAnsiTheme="minorHAnsi" w:cstheme="minorHAnsi"/>
+          <w:b/>
+          <w:bCs/>
+        </w:rPr>
+        <w:t>Configurações do Sistema</w:t>
+      </w:r>
+      <w:r>
+        <w:rPr>
+          <w:rFonts w:asciiTheme="minorHAnsi" w:hAnsiTheme="minorHAnsi" w:cstheme="minorHAnsi"/>
+        </w:rPr>
+        <w:t>:</w:t>
+      </w:r>
+      <w:r>
+        <w:rPr>
+          <w:rFonts w:asciiTheme="minorHAnsi" w:hAnsiTheme="minorHAnsi" w:cstheme="minorHAnsi"/>
+        </w:rPr>
+        <w:t xml:space="preserve"> parâmetros básicos</w:t>
+      </w:r>
+      <w:r>
+        <w:rPr>
+          <w:rFonts w:asciiTheme="minorHAnsi" w:hAnsiTheme="minorHAnsi" w:cstheme="minorHAnsi"/>
+        </w:rPr>
+        <w:t xml:space="preserve"> (valor de CAFÉ, bancos, categorias</w:t>
+      </w:r>
+      <w:r>
+        <w:rPr>
+          <w:rFonts w:asciiTheme="minorHAnsi" w:hAnsiTheme="minorHAnsi" w:cstheme="minorHAnsi"/>
+        </w:rPr>
+        <w:t>)</w:t>
+      </w:r>
+    </w:p>
+    <w:p>
+      <w:pPr>
+        <w:pStyle w:val="Ttulo2"/>
+        <w:rPr>
+          <w:rFonts w:asciiTheme="minorHAnsi" w:hAnsiTheme="minorHAnsi" w:cstheme="minorHAnsi"/>
+        </w:rPr>
+      </w:pPr>
+      <w:r>
+        <w:rPr>
+          <w:rStyle w:val="Forte"/>
+          <w:rFonts w:asciiTheme="minorHAnsi" w:hAnsiTheme="minorHAnsi" w:cstheme="minorHAnsi"/>
+          <w:b/>
+          <w:bCs/>
+        </w:rPr>
+        <w:t>Benefícios e Vantagens</w:t>
+      </w:r>
+    </w:p>
+    <w:p>
+      <w:pPr>
+        <w:pStyle w:val="whitespace-normal"/>
+        <w:numPr>
+          <w:ilvl w:val="0"/>
+          <w:numId w:val="22"/>
+        </w:numPr>
+        <w:rPr>
+          <w:rFonts w:asciiTheme="minorHAnsi" w:hAnsiTheme="minorHAnsi" w:cstheme="minorHAnsi"/>
+        </w:rPr>
+      </w:pPr>
+      <w:r>
+        <w:rPr>
+          <w:rStyle w:val="Forte"/>
+          <w:rFonts w:asciiTheme="minorHAnsi" w:hAnsiTheme="minorHAnsi" w:cstheme="minorHAnsi"/>
+        </w:rPr>
+        <w:t>Automatização</w:t>
+      </w:r>
+      <w:r>
+        <w:rPr>
+          <w:rFonts w:asciiTheme="minorHAnsi" w:hAnsiTheme="minorHAnsi" w:cstheme="minorHAnsi"/>
+        </w:rPr>
+        <w:t>: Redução de erros manuais e agilidade nos processos</w:t>
+      </w:r>
+    </w:p>
+    <w:p>
+      <w:pPr>
+        <w:pStyle w:val="whitespace-normal"/>
+        <w:numPr>
+          <w:ilvl w:val="0"/>
+          <w:numId w:val="22"/>
+        </w:numPr>
+        <w:rPr>
+          <w:rFonts w:asciiTheme="minorHAnsi" w:hAnsiTheme="minorHAnsi" w:cstheme="minorHAnsi"/>
+        </w:rPr>
+      </w:pPr>
+      <w:r>
+        <w:rPr>
+          <w:rStyle w:val="Forte"/>
+          <w:rFonts w:asciiTheme="minorHAnsi" w:hAnsiTheme="minorHAnsi" w:cstheme="minorHAnsi"/>
+        </w:rPr>
+        <w:t>Controle</w:t>
+      </w:r>
+      <w:r>
+        <w:rPr>
+          <w:rFonts w:asciiTheme="minorHAnsi" w:hAnsiTheme="minorHAnsi" w:cstheme="minorHAnsi"/>
+        </w:rPr>
+        <w:t>: Visibilidade completa dos gastos por cliente e projeto</w:t>
+      </w:r>
+    </w:p>
+    <w:p>
+      <w:pPr>
+        <w:pStyle w:val="whitespace-normal"/>
+        <w:numPr>
+          <w:ilvl w:val="0"/>
+          <w:numId w:val="22"/>
+        </w:numPr>
+        <w:rPr>
+          <w:rFonts w:asciiTheme="minorHAnsi" w:hAnsiTheme="minorHAnsi" w:cstheme="minorHAnsi"/>
+        </w:rPr>
+      </w:pPr>
+      <w:r>
+        <w:rPr>
+          <w:rStyle w:val="Forte"/>
+          <w:rFonts w:asciiTheme="minorHAnsi" w:hAnsiTheme="minorHAnsi" w:cstheme="minorHAnsi"/>
+        </w:rPr>
+        <w:t>Relatórios</w:t>
+      </w:r>
+      <w:r>
+        <w:rPr>
+          <w:rFonts w:asciiTheme="minorHAnsi" w:hAnsiTheme="minorHAnsi" w:cstheme="minorHAnsi"/>
+        </w:rPr>
+        <w:t>: Informações precisas para tomada de decisão</w:t>
+      </w:r>
+    </w:p>
+    <w:p>
+      <w:pPr>
+        <w:pStyle w:val="whitespace-normal"/>
+        <w:numPr>
+          <w:ilvl w:val="0"/>
+          <w:numId w:val="22"/>
+        </w:numPr>
+        <w:rPr>
+          <w:rFonts w:asciiTheme="minorHAnsi" w:hAnsiTheme="minorHAnsi" w:cstheme="minorHAnsi"/>
+        </w:rPr>
+      </w:pPr>
+      <w:r>
+        <w:rPr>
+          <w:rStyle w:val="Forte"/>
+          <w:rFonts w:asciiTheme="minorHAnsi" w:hAnsiTheme="minorHAnsi" w:cstheme="minorHAnsi"/>
+        </w:rPr>
+        <w:t>Backup automático</w:t>
+      </w:r>
+      <w:r>
+        <w:rPr>
+          <w:rFonts w:asciiTheme="minorHAnsi" w:hAnsiTheme="minorHAnsi" w:cstheme="minorHAnsi"/>
+        </w:rPr>
+        <w:t>: Proteção contra perda de dados</w:t>
+      </w:r>
+    </w:p>
+    <w:p>
+      <w:pPr>
+        <w:pStyle w:val="whitespace-normal"/>
+        <w:numPr>
+          <w:ilvl w:val="0"/>
+          <w:numId w:val="22"/>
+        </w:numPr>
+        <w:rPr>
+          <w:rFonts w:asciiTheme="minorHAnsi" w:hAnsiTheme="minorHAnsi" w:cstheme="minorHAnsi"/>
+        </w:rPr>
+      </w:pPr>
+      <w:r>
+        <w:rPr>
+          <w:rStyle w:val="Forte"/>
+          <w:rFonts w:asciiTheme="minorHAnsi" w:hAnsiTheme="minorHAnsi" w:cstheme="minorHAnsi"/>
+        </w:rPr>
+        <w:t>Integração</w:t>
+      </w:r>
+      <w:r>
+        <w:rPr>
+          <w:rFonts w:asciiTheme="minorHAnsi" w:hAnsiTheme="minorHAnsi" w:cstheme="minorHAnsi"/>
+        </w:rPr>
+        <w:t>: Importação de dados do sistema DOMÍNIO (RH)</w:t>
+      </w:r>
+    </w:p>
+    <w:p>
+      <w:pPr>
+        <w:pStyle w:val="Ttulo2"/>
+        <w:rPr>
+          <w:rFonts w:asciiTheme="minorHAnsi" w:hAnsiTheme="minorHAnsi" w:cstheme="minorHAnsi"/>
+        </w:rPr>
+      </w:pPr>
+      <w:r>
+        <w:rPr>
+          <w:rStyle w:val="Forte"/>
+          <w:rFonts w:asciiTheme="minorHAnsi" w:hAnsiTheme="minorHAnsi" w:cstheme="minorHAnsi"/>
+          <w:b/>
+          <w:bCs/>
+        </w:rPr>
+        <w:t xml:space="preserve">Funcionalidades </w:t>
+      </w:r>
+      <w:r>
+        <w:rPr>
+          <w:rStyle w:val="Forte"/>
+          <w:rFonts w:asciiTheme="minorHAnsi" w:hAnsiTheme="minorHAnsi" w:cstheme="minorHAnsi"/>
+          <w:b/>
+          <w:bCs/>
+        </w:rPr>
+        <w:t>possíveis de</w:t>
+      </w:r>
+      <w:r>
+        <w:rPr>
+          <w:rStyle w:val="Forte"/>
+          <w:rFonts w:asciiTheme="minorHAnsi" w:hAnsiTheme="minorHAnsi" w:cstheme="minorHAnsi"/>
+          <w:b/>
+          <w:bCs/>
+        </w:rPr>
+        <w:t xml:space="preserve"> serem desenvolvidas</w:t>
+      </w:r>
+    </w:p>
+    <w:p>
+      <w:pPr>
+        <w:pStyle w:val="whitespace-normal"/>
+        <w:numPr>
+          <w:ilvl w:val="0"/>
+          <w:numId w:val="22"/>
+        </w:numPr>
+        <w:rPr>
+          <w:rFonts w:asciiTheme="minorHAnsi" w:hAnsiTheme="minorHAnsi" w:cstheme="minorHAnsi"/>
+        </w:rPr>
+      </w:pPr>
+      <w:r>
+        <w:rPr>
+          <w:rStyle w:val="Forte"/>
+          <w:rFonts w:asciiTheme="minorHAnsi" w:hAnsiTheme="minorHAnsi" w:cstheme="minorHAnsi"/>
+        </w:rPr>
+        <w:t>VT e CAFÉ</w:t>
+      </w:r>
+      <w:r>
+        <w:rPr>
+          <w:rFonts w:asciiTheme="minorHAnsi" w:hAnsiTheme="minorHAnsi" w:cstheme="minorHAnsi"/>
+        </w:rPr>
+        <w:t xml:space="preserve">: </w:t>
+      </w:r>
+      <w:r>
+        <w:rPr>
+          <w:rFonts w:asciiTheme="minorHAnsi" w:hAnsiTheme="minorHAnsi" w:cstheme="minorHAnsi"/>
+        </w:rPr>
+        <w:t>aguardando planilha modelo para criar a importação dos dados</w:t>
+      </w:r>
+    </w:p>
+    <w:p>
+      <w:pPr>
+        <w:pStyle w:val="whitespace-normal"/>
+        <w:numPr>
+          <w:ilvl w:val="0"/>
+          <w:numId w:val="22"/>
+        </w:numPr>
+        <w:rPr>
+          <w:rFonts w:asciiTheme="minorHAnsi" w:hAnsiTheme="minorHAnsi" w:cstheme="minorHAnsi"/>
+        </w:rPr>
+      </w:pPr>
+      <w:r>
+        <w:rPr>
+          <w:rStyle w:val="Forte"/>
+          <w:rFonts w:asciiTheme="minorHAnsi" w:hAnsiTheme="minorHAnsi" w:cstheme="minorHAnsi"/>
+        </w:rPr>
+        <w:t>Integração</w:t>
+      </w:r>
+      <w:r>
+        <w:rPr>
+          <w:rFonts w:asciiTheme="minorHAnsi" w:hAnsiTheme="minorHAnsi" w:cstheme="minorHAnsi"/>
+        </w:rPr>
+        <w:t xml:space="preserve">: </w:t>
+      </w:r>
+      <w:r>
+        <w:rPr>
+          <w:rFonts w:asciiTheme="minorHAnsi" w:hAnsiTheme="minorHAnsi" w:cstheme="minorHAnsi"/>
+        </w:rPr>
+        <w:t xml:space="preserve">criar módulo para importação de </w:t>
+      </w:r>
+      <w:proofErr w:type="spellStart"/>
+      <w:r>
+        <w:rPr>
+          <w:rFonts w:asciiTheme="minorHAnsi" w:hAnsiTheme="minorHAnsi" w:cstheme="minorHAnsi"/>
+          <w:b/>
+          <w:bCs/>
+        </w:rPr>
+        <w:t>NFe</w:t>
+      </w:r>
+      <w:proofErr w:type="spellEnd"/>
+      <w:r>
+        <w:rPr>
+          <w:rFonts w:asciiTheme="minorHAnsi" w:hAnsiTheme="minorHAnsi" w:cstheme="minorHAnsi"/>
+        </w:rPr>
+        <w:t>, melhorando a eficiência da atividade</w:t>
+      </w:r>
+    </w:p>
+    <w:p>
+      <w:pPr>
+        <w:pStyle w:val="whitespace-normal"/>
+        <w:numPr>
+          <w:ilvl w:val="0"/>
+          <w:numId w:val="22"/>
+        </w:numPr>
+        <w:rPr>
+          <w:rFonts w:asciiTheme="minorHAnsi" w:hAnsiTheme="minorHAnsi" w:cstheme="minorHAnsi"/>
+        </w:rPr>
+      </w:pPr>
+      <w:r>
+        <w:rPr>
+          <w:rStyle w:val="Forte"/>
+          <w:rFonts w:asciiTheme="minorHAnsi" w:hAnsiTheme="minorHAnsi" w:cstheme="minorHAnsi"/>
+        </w:rPr>
+        <w:t>Relatórios</w:t>
+      </w:r>
+      <w:r>
+        <w:rPr>
+          <w:rFonts w:asciiTheme="minorHAnsi" w:hAnsiTheme="minorHAnsi" w:cstheme="minorHAnsi"/>
+        </w:rPr>
+        <w:t xml:space="preserve">: </w:t>
+      </w:r>
+      <w:r>
+        <w:rPr>
+          <w:rFonts w:asciiTheme="minorHAnsi" w:hAnsiTheme="minorHAnsi" w:cstheme="minorHAnsi"/>
+        </w:rPr>
+        <w:t>desenvolver relatório de controle de administração de obras, permitindo o acompanhamento através dos eventos/fases da construção</w:t>
+      </w:r>
+    </w:p>
+    <w:p>
+      <w:pPr>
+        <w:pStyle w:val="whitespace-normal"/>
+        <w:numPr>
+          <w:ilvl w:val="0"/>
+          <w:numId w:val="22"/>
+        </w:numPr>
+        <w:rPr>
+          <w:rFonts w:asciiTheme="minorHAnsi" w:hAnsiTheme="minorHAnsi" w:cstheme="minorHAnsi"/>
+        </w:rPr>
+      </w:pPr>
+      <w:r>
+        <w:rPr>
+          <w:rStyle w:val="Forte"/>
+          <w:rFonts w:asciiTheme="minorHAnsi" w:hAnsiTheme="minorHAnsi" w:cstheme="minorHAnsi"/>
+        </w:rPr>
+        <w:t>Correção monetária</w:t>
+      </w:r>
+      <w:r>
+        <w:rPr>
+          <w:rFonts w:asciiTheme="minorHAnsi" w:hAnsiTheme="minorHAnsi" w:cstheme="minorHAnsi"/>
+        </w:rPr>
+        <w:t xml:space="preserve">: </w:t>
+      </w:r>
+      <w:r>
+        <w:rPr>
+          <w:rFonts w:asciiTheme="minorHAnsi" w:hAnsiTheme="minorHAnsi" w:cstheme="minorHAnsi"/>
+        </w:rPr>
+        <w:t xml:space="preserve">introdução de dados oficiais para </w:t>
+      </w:r>
+      <w:r>
+        <w:rPr>
+          <w:rFonts w:asciiTheme="minorHAnsi" w:hAnsiTheme="minorHAnsi" w:cstheme="minorHAnsi"/>
+        </w:rPr>
+        <w:t>correção de contratos</w:t>
+      </w:r>
+    </w:p>
+    <w:p>
+      <w:pPr>
+        <w:rPr>
+          <w:rFonts w:eastAsia="Times New Roman" w:cstheme="minorHAnsi"/>
+          <w:b/>
+          <w:bCs/>
+          <w:kern w:val="36"/>
+          <w:sz w:val="48"/>
+          <w:szCs w:val="48"/>
+          <w:lang w:eastAsia="pt-BR"/>
+        </w:rPr>
+      </w:pPr>
+      <w:r>
+        <w:rPr>
+          <w:rFonts w:eastAsia="Times New Roman" w:cstheme="minorHAnsi"/>
+          <w:b/>
+          <w:bCs/>
+          <w:kern w:val="36"/>
+          <w:sz w:val="48"/>
+          <w:szCs w:val="48"/>
+          <w:lang w:eastAsia="pt-BR"/>
+        </w:rPr>
+        <w:br w:type="page"/>
+      </w:r>
+    </w:p>
+    <w:p>
+      <w:pPr>
         <w:spacing w:before="100" w:beforeAutospacing="1" w:after="100" w:afterAutospacing="1" w:line="240" w:lineRule="auto"/>
         <w:outlineLvl w:val="0"/>
         <w:rPr>
@@ -11914,27 +12674,7 @@
           <w:szCs w:val="24"/>
           <w:lang w:eastAsia="pt-BR"/>
         </w:rPr>
-        <w:t xml:space="preserve">Cria, </w:t>
-      </w:r>
-      <w:proofErr w:type="gramStart"/>
-      <w:r>
-        <w:rPr>
-          <w:rFonts w:eastAsia="Times New Roman" w:cstheme="minorHAnsi"/>
-          <w:sz w:val="24"/>
-          <w:szCs w:val="24"/>
-          <w:lang w:eastAsia="pt-BR"/>
-        </w:rPr>
-        <w:t>Edita ou Exclui</w:t>
-      </w:r>
-      <w:proofErr w:type="gramEnd"/>
-      <w:r>
-        <w:rPr>
-          <w:rFonts w:eastAsia="Times New Roman" w:cstheme="minorHAnsi"/>
-          <w:sz w:val="24"/>
-          <w:szCs w:val="24"/>
-          <w:lang w:eastAsia="pt-BR"/>
-        </w:rPr>
-        <w:t xml:space="preserve"> contrato de gestão de obra</w:t>
+        <w:t>Cria, Edita ou Exclui contrato de gestão de obra</w:t>
       </w:r>
     </w:p>
     <w:p>
@@ -12967,27 +13707,7 @@
           <w:lang w:eastAsia="pt-BR"/>
         </w:rPr>
         <w:lastRenderedPageBreak/>
-        <w:t xml:space="preserve">lançamento é excluído, mas muda o STATUS de ATIVO para EXCLUÍDO, e. ser </w:t>
-      </w:r>
-      <w:proofErr w:type="gramStart"/>
-      <w:r>
-        <w:rPr>
-          <w:rFonts w:eastAsia="Times New Roman" w:cstheme="minorHAnsi"/>
-          <w:sz w:val="24"/>
-          <w:szCs w:val="24"/>
-          <w:lang w:eastAsia="pt-BR"/>
-        </w:rPr>
-        <w:t>for Restaurado</w:t>
-      </w:r>
-      <w:proofErr w:type="gramEnd"/>
-      <w:r>
-        <w:rPr>
-          <w:rFonts w:eastAsia="Times New Roman" w:cstheme="minorHAnsi"/>
-          <w:sz w:val="24"/>
-          <w:szCs w:val="24"/>
-          <w:lang w:eastAsia="pt-BR"/>
-        </w:rPr>
-        <w:t>, muda de EXCLUÍDO para ATIVO, mantendo histórico dessas alterações.</w:t>
+        <w:t>lançamento é excluído, mas muda o STATUS de ATIVO para EXCLUÍDO, e. ser for Restaurado, muda de EXCLUÍDO para ATIVO, mantendo histórico dessas alterações.</w:t>
       </w:r>
     </w:p>
     <w:p>
@@ -15461,27 +16181,7 @@
           <w:szCs w:val="24"/>
           <w:lang w:eastAsia="pt-BR"/>
         </w:rPr>
-        <w:t xml:space="preserve">-preenchido com </w:t>
-      </w:r>
-      <w:proofErr w:type="gramStart"/>
-      <w:r>
-        <w:rPr>
-          <w:rFonts w:eastAsia="Times New Roman" w:cstheme="minorHAnsi"/>
-          <w:sz w:val="24"/>
-          <w:szCs w:val="24"/>
-          <w:lang w:eastAsia="pt-BR"/>
-        </w:rPr>
-        <w:t>as data</w:t>
-      </w:r>
-      <w:proofErr w:type="gramEnd"/>
-      <w:r>
-        <w:rPr>
-          <w:rFonts w:eastAsia="Times New Roman" w:cstheme="minorHAnsi"/>
-          <w:sz w:val="24"/>
-          <w:szCs w:val="24"/>
-          <w:lang w:eastAsia="pt-BR"/>
-        </w:rPr>
-        <w:t xml:space="preserve"> dos relatórios – 5 ou 20)</w:t>
+        <w:t>-preenchido com as data dos relatórios – 5 ou 20)</w:t>
       </w:r>
     </w:p>
     <w:p>
@@ -16130,27 +16830,7 @@
           <w:szCs w:val="24"/>
           <w:lang w:eastAsia="pt-BR"/>
         </w:rPr>
-        <w:t xml:space="preserve">Selecione ou </w:t>
-      </w:r>
-      <w:proofErr w:type="gramStart"/>
-      <w:r>
-        <w:rPr>
-          <w:rFonts w:eastAsia="Times New Roman" w:cstheme="minorHAnsi"/>
-          <w:sz w:val="24"/>
-          <w:szCs w:val="24"/>
-          <w:lang w:eastAsia="pt-BR"/>
-        </w:rPr>
-        <w:t>não Incluir</w:t>
-      </w:r>
-      <w:proofErr w:type="gramEnd"/>
-      <w:r>
-        <w:rPr>
-          <w:rFonts w:eastAsia="Times New Roman" w:cstheme="minorHAnsi"/>
-          <w:sz w:val="24"/>
-          <w:szCs w:val="24"/>
-          <w:lang w:eastAsia="pt-BR"/>
-        </w:rPr>
-        <w:t xml:space="preserve"> lançamentos futuros</w:t>
+        <w:t>Selecione ou não Incluir lançamentos futuros</w:t>
       </w:r>
     </w:p>
     <w:p>
@@ -19675,235 +20355,9 @@
     </w:lvl>
   </w:abstractNum>
   <w:abstractNum w:abstractNumId="1" w15:restartNumberingAfterBreak="0">
-    <w:nsid w:val="0D43797A"/>
+    <w:nsid w:val="05967C52"/>
     <w:multiLevelType w:val="multilevel"/>
-    <w:tmpl w:val="04CA2C86"/>
-    <w:lvl w:ilvl="0">
-      <w:start w:val="1"/>
-      <w:numFmt w:val="decimal"/>
-      <w:lvlText w:val="%1."/>
-      <w:lvlJc w:val="left"/>
-      <w:pPr>
-        <w:tabs>
-          <w:tab w:val="num" w:pos="720"/>
-        </w:tabs>
-        <w:ind w:left="720" w:hanging="360"/>
-      </w:pPr>
-    </w:lvl>
-    <w:lvl w:ilvl="1" w:tentative="1">
-      <w:start w:val="1"/>
-      <w:numFmt w:val="decimal"/>
-      <w:lvlText w:val="%2."/>
-      <w:lvlJc w:val="left"/>
-      <w:pPr>
-        <w:tabs>
-          <w:tab w:val="num" w:pos="1440"/>
-        </w:tabs>
-        <w:ind w:left="1440" w:hanging="360"/>
-      </w:pPr>
-    </w:lvl>
-    <w:lvl w:ilvl="2" w:tentative="1">
-      <w:start w:val="1"/>
-      <w:numFmt w:val="decimal"/>
-      <w:lvlText w:val="%3."/>
-      <w:lvlJc w:val="left"/>
-      <w:pPr>
-        <w:tabs>
-          <w:tab w:val="num" w:pos="2160"/>
-        </w:tabs>
-        <w:ind w:left="2160" w:hanging="360"/>
-      </w:pPr>
-    </w:lvl>
-    <w:lvl w:ilvl="3" w:tentative="1">
-      <w:start w:val="1"/>
-      <w:numFmt w:val="decimal"/>
-      <w:lvlText w:val="%4."/>
-      <w:lvlJc w:val="left"/>
-      <w:pPr>
-        <w:tabs>
-          <w:tab w:val="num" w:pos="2880"/>
-        </w:tabs>
-        <w:ind w:left="2880" w:hanging="360"/>
-      </w:pPr>
-    </w:lvl>
-    <w:lvl w:ilvl="4" w:tentative="1">
-      <w:start w:val="1"/>
-      <w:numFmt w:val="decimal"/>
-      <w:lvlText w:val="%5."/>
-      <w:lvlJc w:val="left"/>
-      <w:pPr>
-        <w:tabs>
-          <w:tab w:val="num" w:pos="3600"/>
-        </w:tabs>
-        <w:ind w:left="3600" w:hanging="360"/>
-      </w:pPr>
-    </w:lvl>
-    <w:lvl w:ilvl="5" w:tentative="1">
-      <w:start w:val="1"/>
-      <w:numFmt w:val="decimal"/>
-      <w:lvlText w:val="%6."/>
-      <w:lvlJc w:val="left"/>
-      <w:pPr>
-        <w:tabs>
-          <w:tab w:val="num" w:pos="4320"/>
-        </w:tabs>
-        <w:ind w:left="4320" w:hanging="360"/>
-      </w:pPr>
-    </w:lvl>
-    <w:lvl w:ilvl="6" w:tentative="1">
-      <w:start w:val="1"/>
-      <w:numFmt w:val="decimal"/>
-      <w:lvlText w:val="%7."/>
-      <w:lvlJc w:val="left"/>
-      <w:pPr>
-        <w:tabs>
-          <w:tab w:val="num" w:pos="5040"/>
-        </w:tabs>
-        <w:ind w:left="5040" w:hanging="360"/>
-      </w:pPr>
-    </w:lvl>
-    <w:lvl w:ilvl="7" w:tentative="1">
-      <w:start w:val="1"/>
-      <w:numFmt w:val="decimal"/>
-      <w:lvlText w:val="%8."/>
-      <w:lvlJc w:val="left"/>
-      <w:pPr>
-        <w:tabs>
-          <w:tab w:val="num" w:pos="5760"/>
-        </w:tabs>
-        <w:ind w:left="5760" w:hanging="360"/>
-      </w:pPr>
-    </w:lvl>
-    <w:lvl w:ilvl="8" w:tentative="1">
-      <w:start w:val="1"/>
-      <w:numFmt w:val="decimal"/>
-      <w:lvlText w:val="%9."/>
-      <w:lvlJc w:val="left"/>
-      <w:pPr>
-        <w:tabs>
-          <w:tab w:val="num" w:pos="6480"/>
-        </w:tabs>
-        <w:ind w:left="6480" w:hanging="360"/>
-      </w:pPr>
-    </w:lvl>
-  </w:abstractNum>
-  <w:abstractNum w:abstractNumId="2" w15:restartNumberingAfterBreak="0">
-    <w:nsid w:val="10891B0D"/>
-    <w:multiLevelType w:val="multilevel"/>
-    <w:tmpl w:val="CC080538"/>
-    <w:lvl w:ilvl="0">
-      <w:start w:val="1"/>
-      <w:numFmt w:val="decimal"/>
-      <w:lvlText w:val="%1."/>
-      <w:lvlJc w:val="left"/>
-      <w:pPr>
-        <w:tabs>
-          <w:tab w:val="num" w:pos="720"/>
-        </w:tabs>
-        <w:ind w:left="720" w:hanging="360"/>
-      </w:pPr>
-    </w:lvl>
-    <w:lvl w:ilvl="1" w:tentative="1">
-      <w:start w:val="1"/>
-      <w:numFmt w:val="decimal"/>
-      <w:lvlText w:val="%2."/>
-      <w:lvlJc w:val="left"/>
-      <w:pPr>
-        <w:tabs>
-          <w:tab w:val="num" w:pos="1440"/>
-        </w:tabs>
-        <w:ind w:left="1440" w:hanging="360"/>
-      </w:pPr>
-    </w:lvl>
-    <w:lvl w:ilvl="2" w:tentative="1">
-      <w:start w:val="1"/>
-      <w:numFmt w:val="decimal"/>
-      <w:lvlText w:val="%3."/>
-      <w:lvlJc w:val="left"/>
-      <w:pPr>
-        <w:tabs>
-          <w:tab w:val="num" w:pos="2160"/>
-        </w:tabs>
-        <w:ind w:left="2160" w:hanging="360"/>
-      </w:pPr>
-    </w:lvl>
-    <w:lvl w:ilvl="3" w:tentative="1">
-      <w:start w:val="1"/>
-      <w:numFmt w:val="decimal"/>
-      <w:lvlText w:val="%4."/>
-      <w:lvlJc w:val="left"/>
-      <w:pPr>
-        <w:tabs>
-          <w:tab w:val="num" w:pos="2880"/>
-        </w:tabs>
-        <w:ind w:left="2880" w:hanging="360"/>
-      </w:pPr>
-    </w:lvl>
-    <w:lvl w:ilvl="4" w:tentative="1">
-      <w:start w:val="1"/>
-      <w:numFmt w:val="decimal"/>
-      <w:lvlText w:val="%5."/>
-      <w:lvlJc w:val="left"/>
-      <w:pPr>
-        <w:tabs>
-          <w:tab w:val="num" w:pos="3600"/>
-        </w:tabs>
-        <w:ind w:left="3600" w:hanging="360"/>
-      </w:pPr>
-    </w:lvl>
-    <w:lvl w:ilvl="5" w:tentative="1">
-      <w:start w:val="1"/>
-      <w:numFmt w:val="decimal"/>
-      <w:lvlText w:val="%6."/>
-      <w:lvlJc w:val="left"/>
-      <w:pPr>
-        <w:tabs>
-          <w:tab w:val="num" w:pos="4320"/>
-        </w:tabs>
-        <w:ind w:left="4320" w:hanging="360"/>
-      </w:pPr>
-    </w:lvl>
-    <w:lvl w:ilvl="6" w:tentative="1">
-      <w:start w:val="1"/>
-      <w:numFmt w:val="decimal"/>
-      <w:lvlText w:val="%7."/>
-      <w:lvlJc w:val="left"/>
-      <w:pPr>
-        <w:tabs>
-          <w:tab w:val="num" w:pos="5040"/>
-        </w:tabs>
-        <w:ind w:left="5040" w:hanging="360"/>
-      </w:pPr>
-    </w:lvl>
-    <w:lvl w:ilvl="7" w:tentative="1">
-      <w:start w:val="1"/>
-      <w:numFmt w:val="decimal"/>
-      <w:lvlText w:val="%8."/>
-      <w:lvlJc w:val="left"/>
-      <w:pPr>
-        <w:tabs>
-          <w:tab w:val="num" w:pos="5760"/>
-        </w:tabs>
-        <w:ind w:left="5760" w:hanging="360"/>
-      </w:pPr>
-    </w:lvl>
-    <w:lvl w:ilvl="8" w:tentative="1">
-      <w:start w:val="1"/>
-      <w:numFmt w:val="decimal"/>
-      <w:lvlText w:val="%9."/>
-      <w:lvlJc w:val="left"/>
-      <w:pPr>
-        <w:tabs>
-          <w:tab w:val="num" w:pos="6480"/>
-        </w:tabs>
-        <w:ind w:left="6480" w:hanging="360"/>
-      </w:pPr>
-    </w:lvl>
-  </w:abstractNum>
-  <w:abstractNum w:abstractNumId="3" w15:restartNumberingAfterBreak="0">
-    <w:nsid w:val="1D852A6F"/>
-    <w:multiLevelType w:val="multilevel"/>
-    <w:tmpl w:val="48C8A0CE"/>
+    <w:tmpl w:val="64C07F10"/>
     <w:lvl w:ilvl="0">
       <w:start w:val="1"/>
       <w:numFmt w:val="bullet"/>
@@ -20049,7 +20503,382 @@
       </w:rPr>
     </w:lvl>
   </w:abstractNum>
+  <w:abstractNum w:abstractNumId="2" w15:restartNumberingAfterBreak="0">
+    <w:nsid w:val="0D43797A"/>
+    <w:multiLevelType w:val="multilevel"/>
+    <w:tmpl w:val="04CA2C86"/>
+    <w:lvl w:ilvl="0">
+      <w:start w:val="1"/>
+      <w:numFmt w:val="decimal"/>
+      <w:lvlText w:val="%1."/>
+      <w:lvlJc w:val="left"/>
+      <w:pPr>
+        <w:tabs>
+          <w:tab w:val="num" w:pos="720"/>
+        </w:tabs>
+        <w:ind w:left="720" w:hanging="360"/>
+      </w:pPr>
+    </w:lvl>
+    <w:lvl w:ilvl="1" w:tentative="1">
+      <w:start w:val="1"/>
+      <w:numFmt w:val="decimal"/>
+      <w:lvlText w:val="%2."/>
+      <w:lvlJc w:val="left"/>
+      <w:pPr>
+        <w:tabs>
+          <w:tab w:val="num" w:pos="1440"/>
+        </w:tabs>
+        <w:ind w:left="1440" w:hanging="360"/>
+      </w:pPr>
+    </w:lvl>
+    <w:lvl w:ilvl="2" w:tentative="1">
+      <w:start w:val="1"/>
+      <w:numFmt w:val="decimal"/>
+      <w:lvlText w:val="%3."/>
+      <w:lvlJc w:val="left"/>
+      <w:pPr>
+        <w:tabs>
+          <w:tab w:val="num" w:pos="2160"/>
+        </w:tabs>
+        <w:ind w:left="2160" w:hanging="360"/>
+      </w:pPr>
+    </w:lvl>
+    <w:lvl w:ilvl="3" w:tentative="1">
+      <w:start w:val="1"/>
+      <w:numFmt w:val="decimal"/>
+      <w:lvlText w:val="%4."/>
+      <w:lvlJc w:val="left"/>
+      <w:pPr>
+        <w:tabs>
+          <w:tab w:val="num" w:pos="2880"/>
+        </w:tabs>
+        <w:ind w:left="2880" w:hanging="360"/>
+      </w:pPr>
+    </w:lvl>
+    <w:lvl w:ilvl="4" w:tentative="1">
+      <w:start w:val="1"/>
+      <w:numFmt w:val="decimal"/>
+      <w:lvlText w:val="%5."/>
+      <w:lvlJc w:val="left"/>
+      <w:pPr>
+        <w:tabs>
+          <w:tab w:val="num" w:pos="3600"/>
+        </w:tabs>
+        <w:ind w:left="3600" w:hanging="360"/>
+      </w:pPr>
+    </w:lvl>
+    <w:lvl w:ilvl="5" w:tentative="1">
+      <w:start w:val="1"/>
+      <w:numFmt w:val="decimal"/>
+      <w:lvlText w:val="%6."/>
+      <w:lvlJc w:val="left"/>
+      <w:pPr>
+        <w:tabs>
+          <w:tab w:val="num" w:pos="4320"/>
+        </w:tabs>
+        <w:ind w:left="4320" w:hanging="360"/>
+      </w:pPr>
+    </w:lvl>
+    <w:lvl w:ilvl="6" w:tentative="1">
+      <w:start w:val="1"/>
+      <w:numFmt w:val="decimal"/>
+      <w:lvlText w:val="%7."/>
+      <w:lvlJc w:val="left"/>
+      <w:pPr>
+        <w:tabs>
+          <w:tab w:val="num" w:pos="5040"/>
+        </w:tabs>
+        <w:ind w:left="5040" w:hanging="360"/>
+      </w:pPr>
+    </w:lvl>
+    <w:lvl w:ilvl="7" w:tentative="1">
+      <w:start w:val="1"/>
+      <w:numFmt w:val="decimal"/>
+      <w:lvlText w:val="%8."/>
+      <w:lvlJc w:val="left"/>
+      <w:pPr>
+        <w:tabs>
+          <w:tab w:val="num" w:pos="5760"/>
+        </w:tabs>
+        <w:ind w:left="5760" w:hanging="360"/>
+      </w:pPr>
+    </w:lvl>
+    <w:lvl w:ilvl="8" w:tentative="1">
+      <w:start w:val="1"/>
+      <w:numFmt w:val="decimal"/>
+      <w:lvlText w:val="%9."/>
+      <w:lvlJc w:val="left"/>
+      <w:pPr>
+        <w:tabs>
+          <w:tab w:val="num" w:pos="6480"/>
+        </w:tabs>
+        <w:ind w:left="6480" w:hanging="360"/>
+      </w:pPr>
+    </w:lvl>
+  </w:abstractNum>
+  <w:abstractNum w:abstractNumId="3" w15:restartNumberingAfterBreak="0">
+    <w:nsid w:val="10891B0D"/>
+    <w:multiLevelType w:val="multilevel"/>
+    <w:tmpl w:val="CC080538"/>
+    <w:lvl w:ilvl="0">
+      <w:start w:val="1"/>
+      <w:numFmt w:val="decimal"/>
+      <w:lvlText w:val="%1."/>
+      <w:lvlJc w:val="left"/>
+      <w:pPr>
+        <w:tabs>
+          <w:tab w:val="num" w:pos="720"/>
+        </w:tabs>
+        <w:ind w:left="720" w:hanging="360"/>
+      </w:pPr>
+    </w:lvl>
+    <w:lvl w:ilvl="1" w:tentative="1">
+      <w:start w:val="1"/>
+      <w:numFmt w:val="decimal"/>
+      <w:lvlText w:val="%2."/>
+      <w:lvlJc w:val="left"/>
+      <w:pPr>
+        <w:tabs>
+          <w:tab w:val="num" w:pos="1440"/>
+        </w:tabs>
+        <w:ind w:left="1440" w:hanging="360"/>
+      </w:pPr>
+    </w:lvl>
+    <w:lvl w:ilvl="2" w:tentative="1">
+      <w:start w:val="1"/>
+      <w:numFmt w:val="decimal"/>
+      <w:lvlText w:val="%3."/>
+      <w:lvlJc w:val="left"/>
+      <w:pPr>
+        <w:tabs>
+          <w:tab w:val="num" w:pos="2160"/>
+        </w:tabs>
+        <w:ind w:left="2160" w:hanging="360"/>
+      </w:pPr>
+    </w:lvl>
+    <w:lvl w:ilvl="3" w:tentative="1">
+      <w:start w:val="1"/>
+      <w:numFmt w:val="decimal"/>
+      <w:lvlText w:val="%4."/>
+      <w:lvlJc w:val="left"/>
+      <w:pPr>
+        <w:tabs>
+          <w:tab w:val="num" w:pos="2880"/>
+        </w:tabs>
+        <w:ind w:left="2880" w:hanging="360"/>
+      </w:pPr>
+    </w:lvl>
+    <w:lvl w:ilvl="4" w:tentative="1">
+      <w:start w:val="1"/>
+      <w:numFmt w:val="decimal"/>
+      <w:lvlText w:val="%5."/>
+      <w:lvlJc w:val="left"/>
+      <w:pPr>
+        <w:tabs>
+          <w:tab w:val="num" w:pos="3600"/>
+        </w:tabs>
+        <w:ind w:left="3600" w:hanging="360"/>
+      </w:pPr>
+    </w:lvl>
+    <w:lvl w:ilvl="5" w:tentative="1">
+      <w:start w:val="1"/>
+      <w:numFmt w:val="decimal"/>
+      <w:lvlText w:val="%6."/>
+      <w:lvlJc w:val="left"/>
+      <w:pPr>
+        <w:tabs>
+          <w:tab w:val="num" w:pos="4320"/>
+        </w:tabs>
+        <w:ind w:left="4320" w:hanging="360"/>
+      </w:pPr>
+    </w:lvl>
+    <w:lvl w:ilvl="6" w:tentative="1">
+      <w:start w:val="1"/>
+      <w:numFmt w:val="decimal"/>
+      <w:lvlText w:val="%7."/>
+      <w:lvlJc w:val="left"/>
+      <w:pPr>
+        <w:tabs>
+          <w:tab w:val="num" w:pos="5040"/>
+        </w:tabs>
+        <w:ind w:left="5040" w:hanging="360"/>
+      </w:pPr>
+    </w:lvl>
+    <w:lvl w:ilvl="7" w:tentative="1">
+      <w:start w:val="1"/>
+      <w:numFmt w:val="decimal"/>
+      <w:lvlText w:val="%8."/>
+      <w:lvlJc w:val="left"/>
+      <w:pPr>
+        <w:tabs>
+          <w:tab w:val="num" w:pos="5760"/>
+        </w:tabs>
+        <w:ind w:left="5760" w:hanging="360"/>
+      </w:pPr>
+    </w:lvl>
+    <w:lvl w:ilvl="8" w:tentative="1">
+      <w:start w:val="1"/>
+      <w:numFmt w:val="decimal"/>
+      <w:lvlText w:val="%9."/>
+      <w:lvlJc w:val="left"/>
+      <w:pPr>
+        <w:tabs>
+          <w:tab w:val="num" w:pos="6480"/>
+        </w:tabs>
+        <w:ind w:left="6480" w:hanging="360"/>
+      </w:pPr>
+    </w:lvl>
+  </w:abstractNum>
   <w:abstractNum w:abstractNumId="4" w15:restartNumberingAfterBreak="0">
+    <w:nsid w:val="1D852A6F"/>
+    <w:multiLevelType w:val="multilevel"/>
+    <w:tmpl w:val="48C8A0CE"/>
+    <w:lvl w:ilvl="0">
+      <w:start w:val="1"/>
+      <w:numFmt w:val="bullet"/>
+      <w:lvlText w:val=""/>
+      <w:lvlJc w:val="left"/>
+      <w:pPr>
+        <w:tabs>
+          <w:tab w:val="num" w:pos="720"/>
+        </w:tabs>
+        <w:ind w:left="720" w:hanging="360"/>
+      </w:pPr>
+      <w:rPr>
+        <w:rFonts w:ascii="Symbol" w:hAnsi="Symbol" w:hint="default"/>
+        <w:sz w:val="20"/>
+      </w:rPr>
+    </w:lvl>
+    <w:lvl w:ilvl="1" w:tentative="1">
+      <w:start w:val="1"/>
+      <w:numFmt w:val="bullet"/>
+      <w:lvlText w:val="o"/>
+      <w:lvlJc w:val="left"/>
+      <w:pPr>
+        <w:tabs>
+          <w:tab w:val="num" w:pos="1440"/>
+        </w:tabs>
+        <w:ind w:left="1440" w:hanging="360"/>
+      </w:pPr>
+      <w:rPr>
+        <w:rFonts w:ascii="Courier New" w:hAnsi="Courier New" w:hint="default"/>
+        <w:sz w:val="20"/>
+      </w:rPr>
+    </w:lvl>
+    <w:lvl w:ilvl="2" w:tentative="1">
+      <w:start w:val="1"/>
+      <w:numFmt w:val="bullet"/>
+      <w:lvlText w:val=""/>
+      <w:lvlJc w:val="left"/>
+      <w:pPr>
+        <w:tabs>
+          <w:tab w:val="num" w:pos="2160"/>
+        </w:tabs>
+        <w:ind w:left="2160" w:hanging="360"/>
+      </w:pPr>
+      <w:rPr>
+        <w:rFonts w:ascii="Wingdings" w:hAnsi="Wingdings" w:hint="default"/>
+        <w:sz w:val="20"/>
+      </w:rPr>
+    </w:lvl>
+    <w:lvl w:ilvl="3" w:tentative="1">
+      <w:start w:val="1"/>
+      <w:numFmt w:val="bullet"/>
+      <w:lvlText w:val=""/>
+      <w:lvlJc w:val="left"/>
+      <w:pPr>
+        <w:tabs>
+          <w:tab w:val="num" w:pos="2880"/>
+        </w:tabs>
+        <w:ind w:left="2880" w:hanging="360"/>
+      </w:pPr>
+      <w:rPr>
+        <w:rFonts w:ascii="Wingdings" w:hAnsi="Wingdings" w:hint="default"/>
+        <w:sz w:val="20"/>
+      </w:rPr>
+    </w:lvl>
+    <w:lvl w:ilvl="4" w:tentative="1">
+      <w:start w:val="1"/>
+      <w:numFmt w:val="bullet"/>
+      <w:lvlText w:val=""/>
+      <w:lvlJc w:val="left"/>
+      <w:pPr>
+        <w:tabs>
+          <w:tab w:val="num" w:pos="3600"/>
+        </w:tabs>
+        <w:ind w:left="3600" w:hanging="360"/>
+      </w:pPr>
+      <w:rPr>
+        <w:rFonts w:ascii="Wingdings" w:hAnsi="Wingdings" w:hint="default"/>
+        <w:sz w:val="20"/>
+      </w:rPr>
+    </w:lvl>
+    <w:lvl w:ilvl="5" w:tentative="1">
+      <w:start w:val="1"/>
+      <w:numFmt w:val="bullet"/>
+      <w:lvlText w:val=""/>
+      <w:lvlJc w:val="left"/>
+      <w:pPr>
+        <w:tabs>
+          <w:tab w:val="num" w:pos="4320"/>
+        </w:tabs>
+        <w:ind w:left="4320" w:hanging="360"/>
+      </w:pPr>
+      <w:rPr>
+        <w:rFonts w:ascii="Wingdings" w:hAnsi="Wingdings" w:hint="default"/>
+        <w:sz w:val="20"/>
+      </w:rPr>
+    </w:lvl>
+    <w:lvl w:ilvl="6" w:tentative="1">
+      <w:start w:val="1"/>
+      <w:numFmt w:val="bullet"/>
+      <w:lvlText w:val=""/>
+      <w:lvlJc w:val="left"/>
+      <w:pPr>
+        <w:tabs>
+          <w:tab w:val="num" w:pos="5040"/>
+        </w:tabs>
+        <w:ind w:left="5040" w:hanging="360"/>
+      </w:pPr>
+      <w:rPr>
+        <w:rFonts w:ascii="Wingdings" w:hAnsi="Wingdings" w:hint="default"/>
+        <w:sz w:val="20"/>
+      </w:rPr>
+    </w:lvl>
+    <w:lvl w:ilvl="7" w:tentative="1">
+      <w:start w:val="1"/>
+      <w:numFmt w:val="bullet"/>
+      <w:lvlText w:val=""/>
+      <w:lvlJc w:val="left"/>
+      <w:pPr>
+        <w:tabs>
+          <w:tab w:val="num" w:pos="5760"/>
+        </w:tabs>
+        <w:ind w:left="5760" w:hanging="360"/>
+      </w:pPr>
+      <w:rPr>
+        <w:rFonts w:ascii="Wingdings" w:hAnsi="Wingdings" w:hint="default"/>
+        <w:sz w:val="20"/>
+      </w:rPr>
+    </w:lvl>
+    <w:lvl w:ilvl="8" w:tentative="1">
+      <w:start w:val="1"/>
+      <w:numFmt w:val="bullet"/>
+      <w:lvlText w:val=""/>
+      <w:lvlJc w:val="left"/>
+      <w:pPr>
+        <w:tabs>
+          <w:tab w:val="num" w:pos="6480"/>
+        </w:tabs>
+        <w:ind w:left="6480" w:hanging="360"/>
+      </w:pPr>
+      <w:rPr>
+        <w:rFonts w:ascii="Wingdings" w:hAnsi="Wingdings" w:hint="default"/>
+        <w:sz w:val="20"/>
+      </w:rPr>
+    </w:lvl>
+  </w:abstractNum>
+  <w:abstractNum w:abstractNumId="5" w15:restartNumberingAfterBreak="0">
     <w:nsid w:val="21D10CA0"/>
     <w:multiLevelType w:val="hybridMultilevel"/>
     <w:tmpl w:val="0B1819FC"/>
@@ -20140,7 +20969,156 @@
       </w:pPr>
     </w:lvl>
   </w:abstractNum>
-  <w:abstractNum w:abstractNumId="5" w15:restartNumberingAfterBreak="0">
+  <w:abstractNum w:abstractNumId="6" w15:restartNumberingAfterBreak="0">
+    <w:nsid w:val="2B145FC8"/>
+    <w:multiLevelType w:val="multilevel"/>
+    <w:tmpl w:val="70BC536A"/>
+    <w:lvl w:ilvl="0">
+      <w:start w:val="1"/>
+      <w:numFmt w:val="bullet"/>
+      <w:lvlText w:val=""/>
+      <w:lvlJc w:val="left"/>
+      <w:pPr>
+        <w:tabs>
+          <w:tab w:val="num" w:pos="720"/>
+        </w:tabs>
+        <w:ind w:left="720" w:hanging="360"/>
+      </w:pPr>
+      <w:rPr>
+        <w:rFonts w:ascii="Symbol" w:hAnsi="Symbol" w:hint="default"/>
+        <w:sz w:val="20"/>
+      </w:rPr>
+    </w:lvl>
+    <w:lvl w:ilvl="1" w:tentative="1">
+      <w:start w:val="1"/>
+      <w:numFmt w:val="bullet"/>
+      <w:lvlText w:val="o"/>
+      <w:lvlJc w:val="left"/>
+      <w:pPr>
+        <w:tabs>
+          <w:tab w:val="num" w:pos="1440"/>
+        </w:tabs>
+        <w:ind w:left="1440" w:hanging="360"/>
+      </w:pPr>
+      <w:rPr>
+        <w:rFonts w:ascii="Courier New" w:hAnsi="Courier New" w:hint="default"/>
+        <w:sz w:val="20"/>
+      </w:rPr>
+    </w:lvl>
+    <w:lvl w:ilvl="2" w:tentative="1">
+      <w:start w:val="1"/>
+      <w:numFmt w:val="bullet"/>
+      <w:lvlText w:val=""/>
+      <w:lvlJc w:val="left"/>
+      <w:pPr>
+        <w:tabs>
+          <w:tab w:val="num" w:pos="2160"/>
+        </w:tabs>
+        <w:ind w:left="2160" w:hanging="360"/>
+      </w:pPr>
+      <w:rPr>
+        <w:rFonts w:ascii="Wingdings" w:hAnsi="Wingdings" w:hint="default"/>
+        <w:sz w:val="20"/>
+      </w:rPr>
+    </w:lvl>
+    <w:lvl w:ilvl="3" w:tentative="1">
+      <w:start w:val="1"/>
+      <w:numFmt w:val="bullet"/>
+      <w:lvlText w:val=""/>
+      <w:lvlJc w:val="left"/>
+      <w:pPr>
+        <w:tabs>
+          <w:tab w:val="num" w:pos="2880"/>
+        </w:tabs>
+        <w:ind w:left="2880" w:hanging="360"/>
+      </w:pPr>
+      <w:rPr>
+        <w:rFonts w:ascii="Wingdings" w:hAnsi="Wingdings" w:hint="default"/>
+        <w:sz w:val="20"/>
+      </w:rPr>
+    </w:lvl>
+    <w:lvl w:ilvl="4" w:tentative="1">
+      <w:start w:val="1"/>
+      <w:numFmt w:val="bullet"/>
+      <w:lvlText w:val=""/>
+      <w:lvlJc w:val="left"/>
+      <w:pPr>
+        <w:tabs>
+          <w:tab w:val="num" w:pos="3600"/>
+        </w:tabs>
+        <w:ind w:left="3600" w:hanging="360"/>
+      </w:pPr>
+      <w:rPr>
+        <w:rFonts w:ascii="Wingdings" w:hAnsi="Wingdings" w:hint="default"/>
+        <w:sz w:val="20"/>
+      </w:rPr>
+    </w:lvl>
+    <w:lvl w:ilvl="5" w:tentative="1">
+      <w:start w:val="1"/>
+      <w:numFmt w:val="bullet"/>
+      <w:lvlText w:val=""/>
+      <w:lvlJc w:val="left"/>
+      <w:pPr>
+        <w:tabs>
+          <w:tab w:val="num" w:pos="4320"/>
+        </w:tabs>
+        <w:ind w:left="4320" w:hanging="360"/>
+      </w:pPr>
+      <w:rPr>
+        <w:rFonts w:ascii="Wingdings" w:hAnsi="Wingdings" w:hint="default"/>
+        <w:sz w:val="20"/>
+      </w:rPr>
+    </w:lvl>
+    <w:lvl w:ilvl="6" w:tentative="1">
+      <w:start w:val="1"/>
+      <w:numFmt w:val="bullet"/>
+      <w:lvlText w:val=""/>
+      <w:lvlJc w:val="left"/>
+      <w:pPr>
+        <w:tabs>
+          <w:tab w:val="num" w:pos="5040"/>
+        </w:tabs>
+        <w:ind w:left="5040" w:hanging="360"/>
+      </w:pPr>
+      <w:rPr>
+        <w:rFonts w:ascii="Wingdings" w:hAnsi="Wingdings" w:hint="default"/>
+        <w:sz w:val="20"/>
+      </w:rPr>
+    </w:lvl>
+    <w:lvl w:ilvl="7" w:tentative="1">
+      <w:start w:val="1"/>
+      <w:numFmt w:val="bullet"/>
+      <w:lvlText w:val=""/>
+      <w:lvlJc w:val="left"/>
+      <w:pPr>
+        <w:tabs>
+          <w:tab w:val="num" w:pos="5760"/>
+        </w:tabs>
+        <w:ind w:left="5760" w:hanging="360"/>
+      </w:pPr>
+      <w:rPr>
+        <w:rFonts w:ascii="Wingdings" w:hAnsi="Wingdings" w:hint="default"/>
+        <w:sz w:val="20"/>
+      </w:rPr>
+    </w:lvl>
+    <w:lvl w:ilvl="8" w:tentative="1">
+      <w:start w:val="1"/>
+      <w:numFmt w:val="bullet"/>
+      <w:lvlText w:val=""/>
+      <w:lvlJc w:val="left"/>
+      <w:pPr>
+        <w:tabs>
+          <w:tab w:val="num" w:pos="6480"/>
+        </w:tabs>
+        <w:ind w:left="6480" w:hanging="360"/>
+      </w:pPr>
+      <w:rPr>
+        <w:rFonts w:ascii="Wingdings" w:hAnsi="Wingdings" w:hint="default"/>
+        <w:sz w:val="20"/>
+      </w:rPr>
+    </w:lvl>
+  </w:abstractNum>
+  <w:abstractNum w:abstractNumId="7" w15:restartNumberingAfterBreak="0">
     <w:nsid w:val="385422AE"/>
     <w:multiLevelType w:val="multilevel"/>
     <w:tmpl w:val="2D72C438"/>
@@ -20257,7 +21235,156 @@
       </w:pPr>
     </w:lvl>
   </w:abstractNum>
-  <w:abstractNum w:abstractNumId="6" w15:restartNumberingAfterBreak="0">
+  <w:abstractNum w:abstractNumId="8" w15:restartNumberingAfterBreak="0">
+    <w:nsid w:val="3C804A8B"/>
+    <w:multiLevelType w:val="multilevel"/>
+    <w:tmpl w:val="00064FAC"/>
+    <w:lvl w:ilvl="0">
+      <w:start w:val="1"/>
+      <w:numFmt w:val="bullet"/>
+      <w:lvlText w:val=""/>
+      <w:lvlJc w:val="left"/>
+      <w:pPr>
+        <w:tabs>
+          <w:tab w:val="num" w:pos="720"/>
+        </w:tabs>
+        <w:ind w:left="720" w:hanging="360"/>
+      </w:pPr>
+      <w:rPr>
+        <w:rFonts w:ascii="Symbol" w:hAnsi="Symbol" w:hint="default"/>
+        <w:sz w:val="20"/>
+      </w:rPr>
+    </w:lvl>
+    <w:lvl w:ilvl="1" w:tentative="1">
+      <w:start w:val="1"/>
+      <w:numFmt w:val="bullet"/>
+      <w:lvlText w:val="o"/>
+      <w:lvlJc w:val="left"/>
+      <w:pPr>
+        <w:tabs>
+          <w:tab w:val="num" w:pos="1440"/>
+        </w:tabs>
+        <w:ind w:left="1440" w:hanging="360"/>
+      </w:pPr>
+      <w:rPr>
+        <w:rFonts w:ascii="Courier New" w:hAnsi="Courier New" w:hint="default"/>
+        <w:sz w:val="20"/>
+      </w:rPr>
+    </w:lvl>
+    <w:lvl w:ilvl="2" w:tentative="1">
+      <w:start w:val="1"/>
+      <w:numFmt w:val="bullet"/>
+      <w:lvlText w:val=""/>
+      <w:lvlJc w:val="left"/>
+      <w:pPr>
+        <w:tabs>
+          <w:tab w:val="num" w:pos="2160"/>
+        </w:tabs>
+        <w:ind w:left="2160" w:hanging="360"/>
+      </w:pPr>
+      <w:rPr>
+        <w:rFonts w:ascii="Wingdings" w:hAnsi="Wingdings" w:hint="default"/>
+        <w:sz w:val="20"/>
+      </w:rPr>
+    </w:lvl>
+    <w:lvl w:ilvl="3" w:tentative="1">
+      <w:start w:val="1"/>
+      <w:numFmt w:val="bullet"/>
+      <w:lvlText w:val=""/>
+      <w:lvlJc w:val="left"/>
+      <w:pPr>
+        <w:tabs>
+          <w:tab w:val="num" w:pos="2880"/>
+        </w:tabs>
+        <w:ind w:left="2880" w:hanging="360"/>
+      </w:pPr>
+      <w:rPr>
+        <w:rFonts w:ascii="Wingdings" w:hAnsi="Wingdings" w:hint="default"/>
+        <w:sz w:val="20"/>
+      </w:rPr>
+    </w:lvl>
+    <w:lvl w:ilvl="4" w:tentative="1">
+      <w:start w:val="1"/>
+      <w:numFmt w:val="bullet"/>
+      <w:lvlText w:val=""/>
+      <w:lvlJc w:val="left"/>
+      <w:pPr>
+        <w:tabs>
+          <w:tab w:val="num" w:pos="3600"/>
+        </w:tabs>
+        <w:ind w:left="3600" w:hanging="360"/>
+      </w:pPr>
+      <w:rPr>
+        <w:rFonts w:ascii="Wingdings" w:hAnsi="Wingdings" w:hint="default"/>
+        <w:sz w:val="20"/>
+      </w:rPr>
+    </w:lvl>
+    <w:lvl w:ilvl="5" w:tentative="1">
+      <w:start w:val="1"/>
+      <w:numFmt w:val="bullet"/>
+      <w:lvlText w:val=""/>
+      <w:lvlJc w:val="left"/>
+      <w:pPr>
+        <w:tabs>
+          <w:tab w:val="num" w:pos="4320"/>
+        </w:tabs>
+        <w:ind w:left="4320" w:hanging="360"/>
+      </w:pPr>
+      <w:rPr>
+        <w:rFonts w:ascii="Wingdings" w:hAnsi="Wingdings" w:hint="default"/>
+        <w:sz w:val="20"/>
+      </w:rPr>
+    </w:lvl>
+    <w:lvl w:ilvl="6" w:tentative="1">
+      <w:start w:val="1"/>
+      <w:numFmt w:val="bullet"/>
+      <w:lvlText w:val=""/>
+      <w:lvlJc w:val="left"/>
+      <w:pPr>
+        <w:tabs>
+          <w:tab w:val="num" w:pos="5040"/>
+        </w:tabs>
+        <w:ind w:left="5040" w:hanging="360"/>
+      </w:pPr>
+      <w:rPr>
+        <w:rFonts w:ascii="Wingdings" w:hAnsi="Wingdings" w:hint="default"/>
+        <w:sz w:val="20"/>
+      </w:rPr>
+    </w:lvl>
+    <w:lvl w:ilvl="7" w:tentative="1">
+      <w:start w:val="1"/>
+      <w:numFmt w:val="bullet"/>
+      <w:lvlText w:val=""/>
+      <w:lvlJc w:val="left"/>
+      <w:pPr>
+        <w:tabs>
+          <w:tab w:val="num" w:pos="5760"/>
+        </w:tabs>
+        <w:ind w:left="5760" w:hanging="360"/>
+      </w:pPr>
+      <w:rPr>
+        <w:rFonts w:ascii="Wingdings" w:hAnsi="Wingdings" w:hint="default"/>
+        <w:sz w:val="20"/>
+      </w:rPr>
+    </w:lvl>
+    <w:lvl w:ilvl="8" w:tentative="1">
+      <w:start w:val="1"/>
+      <w:numFmt w:val="bullet"/>
+      <w:lvlText w:val=""/>
+      <w:lvlJc w:val="left"/>
+      <w:pPr>
+        <w:tabs>
+          <w:tab w:val="num" w:pos="6480"/>
+        </w:tabs>
+        <w:ind w:left="6480" w:hanging="360"/>
+      </w:pPr>
+      <w:rPr>
+        <w:rFonts w:ascii="Wingdings" w:hAnsi="Wingdings" w:hint="default"/>
+        <w:sz w:val="20"/>
+      </w:rPr>
+    </w:lvl>
+  </w:abstractNum>
+  <w:abstractNum w:abstractNumId="9" w15:restartNumberingAfterBreak="0">
     <w:nsid w:val="42D407AF"/>
     <w:multiLevelType w:val="multilevel"/>
     <w:tmpl w:val="EE828754"/>
@@ -20370,7 +21497,7 @@
       </w:pPr>
     </w:lvl>
   </w:abstractNum>
-  <w:abstractNum w:abstractNumId="7" w15:restartNumberingAfterBreak="0">
+  <w:abstractNum w:abstractNumId="10" w15:restartNumberingAfterBreak="0">
     <w:nsid w:val="464A55F1"/>
     <w:multiLevelType w:val="hybridMultilevel"/>
     <w:tmpl w:val="FC807736"/>
@@ -20456,7 +21583,7 @@
       </w:pPr>
     </w:lvl>
   </w:abstractNum>
-  <w:abstractNum w:abstractNumId="8" w15:restartNumberingAfterBreak="0">
+  <w:abstractNum w:abstractNumId="11" w15:restartNumberingAfterBreak="0">
     <w:nsid w:val="4732106A"/>
     <w:multiLevelType w:val="hybridMultilevel"/>
     <w:tmpl w:val="FC807736"/>
@@ -20542,7 +21669,7 @@
       </w:pPr>
     </w:lvl>
   </w:abstractNum>
-  <w:abstractNum w:abstractNumId="9" w15:restartNumberingAfterBreak="0">
+  <w:abstractNum w:abstractNumId="12" w15:restartNumberingAfterBreak="0">
     <w:nsid w:val="490348C5"/>
     <w:multiLevelType w:val="hybridMultilevel"/>
     <w:tmpl w:val="27E844A4"/>
@@ -20633,7 +21760,7 @@
       </w:pPr>
     </w:lvl>
   </w:abstractNum>
-  <w:abstractNum w:abstractNumId="10" w15:restartNumberingAfterBreak="0">
+  <w:abstractNum w:abstractNumId="13" w15:restartNumberingAfterBreak="0">
     <w:nsid w:val="4E5B4171"/>
     <w:multiLevelType w:val="hybridMultilevel"/>
     <w:tmpl w:val="E91A35B8"/>
@@ -20719,7 +21846,7 @@
       </w:pPr>
     </w:lvl>
   </w:abstractNum>
-  <w:abstractNum w:abstractNumId="11" w15:restartNumberingAfterBreak="0">
+  <w:abstractNum w:abstractNumId="14" w15:restartNumberingAfterBreak="0">
     <w:nsid w:val="551E319F"/>
     <w:multiLevelType w:val="hybridMultilevel"/>
     <w:tmpl w:val="38E63C50"/>
@@ -20805,7 +21932,7 @@
       </w:pPr>
     </w:lvl>
   </w:abstractNum>
-  <w:abstractNum w:abstractNumId="12" w15:restartNumberingAfterBreak="0">
+  <w:abstractNum w:abstractNumId="15" w15:restartNumberingAfterBreak="0">
     <w:nsid w:val="5BE1038F"/>
     <w:multiLevelType w:val="hybridMultilevel"/>
     <w:tmpl w:val="75F8447C"/>
@@ -20897,7 +22024,7 @@
       </w:pPr>
     </w:lvl>
   </w:abstractNum>
-  <w:abstractNum w:abstractNumId="13" w15:restartNumberingAfterBreak="0">
+  <w:abstractNum w:abstractNumId="16" w15:restartNumberingAfterBreak="0">
     <w:nsid w:val="5D9D1448"/>
     <w:multiLevelType w:val="multilevel"/>
     <w:tmpl w:val="6BD09C52"/>
@@ -21010,7 +22137,7 @@
       </w:pPr>
     </w:lvl>
   </w:abstractNum>
-  <w:abstractNum w:abstractNumId="14" w15:restartNumberingAfterBreak="0">
+  <w:abstractNum w:abstractNumId="17" w15:restartNumberingAfterBreak="0">
     <w:nsid w:val="656237DC"/>
     <w:multiLevelType w:val="multilevel"/>
     <w:tmpl w:val="4A76F134"/>
@@ -21159,7 +22286,7 @@
       </w:rPr>
     </w:lvl>
   </w:abstractNum>
-  <w:abstractNum w:abstractNumId="15" w15:restartNumberingAfterBreak="0">
+  <w:abstractNum w:abstractNumId="18" w15:restartNumberingAfterBreak="0">
     <w:nsid w:val="68A84FE6"/>
     <w:multiLevelType w:val="hybridMultilevel"/>
     <w:tmpl w:val="76D6812C"/>
@@ -21251,7 +22378,7 @@
       </w:pPr>
     </w:lvl>
   </w:abstractNum>
-  <w:abstractNum w:abstractNumId="16" w15:restartNumberingAfterBreak="0">
+  <w:abstractNum w:abstractNumId="19" w15:restartNumberingAfterBreak="0">
     <w:nsid w:val="6AC83B3C"/>
     <w:multiLevelType w:val="multilevel"/>
     <w:tmpl w:val="56BA70B0"/>
@@ -21364,7 +22491,7 @@
       </w:pPr>
     </w:lvl>
   </w:abstractNum>
-  <w:abstractNum w:abstractNumId="17" w15:restartNumberingAfterBreak="0">
+  <w:abstractNum w:abstractNumId="20" w15:restartNumberingAfterBreak="0">
     <w:nsid w:val="775E10E5"/>
     <w:multiLevelType w:val="hybridMultilevel"/>
     <w:tmpl w:val="4B7C6288"/>
@@ -21453,7 +22580,7 @@
       </w:pPr>
     </w:lvl>
   </w:abstractNum>
-  <w:abstractNum w:abstractNumId="18" w15:restartNumberingAfterBreak="0">
+  <w:abstractNum w:abstractNumId="21" w15:restartNumberingAfterBreak="0">
     <w:nsid w:val="7E8757FB"/>
     <w:multiLevelType w:val="hybridMultilevel"/>
     <w:tmpl w:val="A022B8CC"/>
@@ -21540,61 +22667,70 @@
     </w:lvl>
   </w:abstractNum>
   <w:num w:numId="1" w16cid:durableId="821776656">
+    <w:abstractNumId w:val="19"/>
+  </w:num>
+  <w:num w:numId="2" w16cid:durableId="533739256">
     <w:abstractNumId w:val="16"/>
   </w:num>
-  <w:num w:numId="2" w16cid:durableId="533739256">
+  <w:num w:numId="3" w16cid:durableId="2038384189">
+    <w:abstractNumId w:val="17"/>
+  </w:num>
+  <w:num w:numId="4" w16cid:durableId="1174102223">
+    <w:abstractNumId w:val="2"/>
+  </w:num>
+  <w:num w:numId="5" w16cid:durableId="657927767">
+    <w:abstractNumId w:val="7"/>
+  </w:num>
+  <w:num w:numId="6" w16cid:durableId="1943105886">
+    <w:abstractNumId w:val="3"/>
+  </w:num>
+  <w:num w:numId="7" w16cid:durableId="1825387013">
+    <w:abstractNumId w:val="9"/>
+  </w:num>
+  <w:num w:numId="8" w16cid:durableId="684601632">
+    <w:abstractNumId w:val="4"/>
+  </w:num>
+  <w:num w:numId="9" w16cid:durableId="659312573">
     <w:abstractNumId w:val="13"/>
   </w:num>
-  <w:num w:numId="3" w16cid:durableId="2038384189">
-    <w:abstractNumId w:val="14"/>
+  <w:num w:numId="10" w16cid:durableId="2060281058">
+    <w:abstractNumId w:val="20"/>
   </w:num>
-  <w:num w:numId="4" w16cid:durableId="1174102223">
-    <w:abstractNumId w:val="1"/>
-  </w:num>
-  <w:num w:numId="5" w16cid:durableId="657927767">
-    <w:abstractNumId w:val="5"/>
-  </w:num>
-  <w:num w:numId="6" w16cid:durableId="1943105886">
-    <w:abstractNumId w:val="2"/>
-  </w:num>
-  <w:num w:numId="7" w16cid:durableId="1825387013">
-    <w:abstractNumId w:val="6"/>
-  </w:num>
-  <w:num w:numId="8" w16cid:durableId="684601632">
-    <w:abstractNumId w:val="3"/>
-  </w:num>
-  <w:num w:numId="9" w16cid:durableId="659312573">
+  <w:num w:numId="11" w16cid:durableId="1290626071">
     <w:abstractNumId w:val="10"/>
   </w:num>
-  <w:num w:numId="10" w16cid:durableId="2060281058">
-    <w:abstractNumId w:val="17"/>
-  </w:num>
-  <w:num w:numId="11" w16cid:durableId="1290626071">
-    <w:abstractNumId w:val="7"/>
-  </w:num>
   <w:num w:numId="12" w16cid:durableId="328169730">
-    <w:abstractNumId w:val="18"/>
+    <w:abstractNumId w:val="21"/>
   </w:num>
   <w:num w:numId="13" w16cid:durableId="1673143689">
-    <w:abstractNumId w:val="8"/>
+    <w:abstractNumId w:val="11"/>
   </w:num>
   <w:num w:numId="14" w16cid:durableId="2068334047">
     <w:abstractNumId w:val="0"/>
   </w:num>
   <w:num w:numId="15" w16cid:durableId="1659385264">
-    <w:abstractNumId w:val="11"/>
+    <w:abstractNumId w:val="14"/>
   </w:num>
   <w:num w:numId="16" w16cid:durableId="1645616859">
-    <w:abstractNumId w:val="9"/>
+    <w:abstractNumId w:val="12"/>
   </w:num>
   <w:num w:numId="17" w16cid:durableId="1462503294">
-    <w:abstractNumId w:val="4"/>
+    <w:abstractNumId w:val="5"/>
   </w:num>
   <w:num w:numId="18" w16cid:durableId="2011059417">
+    <w:abstractNumId w:val="18"/>
+  </w:num>
+  <w:num w:numId="19" w16cid:durableId="2117360498">
     <w:abstractNumId w:val="15"/>
   </w:num>
-  <w:num w:numId="19" w16cid:durableId="2117360498">
-    <w:abstractNumId w:val="12"/>
+  <w:num w:numId="20" w16cid:durableId="303850676">
+    <w:abstractNumId w:val="8"/>
+  </w:num>
+  <w:num w:numId="21" w16cid:durableId="1876768851">
+    <w:abstractNumId w:val="6"/>
+  </w:num>
+  <w:num w:numId="22" w16cid:durableId="1308123419">
+    <w:abstractNumId w:val="1"/>
   </w:num>
 </w:numbering>
 </file>

</xml_diff>